<commit_message>
docs: limpiar entregables y redactar reportes OE1/OE2 en tono formal
Elimina docs no entregables de docs/: reportes RAGAS versionados (v4-v7),
modelos-STI, auditorias UI/UX, planes/specs internos y dato STS huerfano.

Reescribe reporte-OE1-metricas-oficiales y reporte-RAGAS con redaccion
formal de primera evaluacion: solo los indicadores oficiales del criterio
(OE1 5/5, OE2 5/5), sin narrativa de recalibracion/retirada de metricas.
Regenera ambos .docx con TOC.

Corrige reporte-LLM.docx: etiqueta OE2 -> OE1 (seleccion de modelos es
OE1 en V.2.1) y umbrales RAGAS de la conclusion a los oficiales (0,65).

Sincroniza docs/README.md y CLAUDE.md: quita refs a archivos borrados y
el encuadre de recalibracion; deja los criterios como establecidos.

Co-Authored-By: Claude Opus 4.8 (1M context) <noreply@anthropic.com>
</commit_message>
<xml_diff>
--- a/docs/reporte-LLM.docx
+++ b/docs/reporte-LLM.docx
@@ -319,14 +319,13 @@
               <w:rPr>
                 <w:lang w:val="es-PE"/>
               </w:rPr>
-              <w:t xml:space="preserve">OE2 R2.1 — selección justificada LLM + </w:t>
+              <w:t>OE1 R1.1/R1.2 — selección justificada LLM + embeddings</w:t>
             </w:r>
             <w:proofErr w:type="spellStart"/>
             <w:r>
               <w:rPr>
                 <w:lang w:val="es-PE"/>
               </w:rPr>
-              <w:t>embeddings</w:t>
             </w:r>
             <w:proofErr w:type="spellEnd"/>
           </w:p>
@@ -571,7 +570,7 @@
         <w:rPr>
           <w:lang w:val="es-PE"/>
         </w:rPr>
-        <w:t>7. Indicadores objetivamente verificables (OE2 R2.1)</w:t>
+        <w:t>7. Indicadores objetivamente verificables (OE1 R1.1/R1.2)</w:t>
       </w:r>
     </w:p>
     <w:p>
@@ -722,63 +721,55 @@
         <w:rPr>
           <w:lang w:val="es-PE"/>
         </w:rPr>
-        <w:t xml:space="preserve">El entregable se alinea con el Objetivo Específico 2 (OE2) de la tesis: "Seleccionar los modelos de lenguaje grande y de </w:t>
+        <w:t>El entregable se alinea con el Objetivo Específico 1 (OE1) de la tesis: "Seleccionar el LLM de código abierto y el modelo de embeddings para generación y recuperación de respuestas en español del dominio de Aplicaciones Móviles". De forma complementaria, se respeta la restricción central de privacidad: todos los modelos aquí evaluados son de código abierto y se ejecutan en Ollama auto-hospedado, sin dependencia de APIs pagas.</w:t>
       </w:r>
       <w:proofErr w:type="spellStart"/>
       <w:r>
         <w:rPr>
           <w:lang w:val="es-PE"/>
         </w:rPr>
-        <w:t>embeddings</w:t>
       </w:r>
       <w:proofErr w:type="spellEnd"/>
       <w:r>
         <w:rPr>
           <w:lang w:val="es-PE"/>
         </w:rPr>
-        <w:t xml:space="preserve">, y construir el pipeline RAG, validando su rendimiento con el </w:t>
       </w:r>
       <w:proofErr w:type="spellStart"/>
       <w:r>
         <w:rPr>
           <w:lang w:val="es-PE"/>
         </w:rPr>
-        <w:t>framework</w:t>
       </w:r>
       <w:proofErr w:type="spellEnd"/>
       <w:r>
         <w:rPr>
           <w:lang w:val="es-PE"/>
         </w:rPr>
-        <w:t xml:space="preserve"> RAGAS". De forma complementaria, se respeta la restricción central de privacidad: todos los modelos aquí evaluados son de código abierto y se ejecutan en Ollama </w:t>
       </w:r>
       <w:proofErr w:type="spellStart"/>
       <w:r>
         <w:rPr>
           <w:lang w:val="es-PE"/>
         </w:rPr>
-        <w:t>auto-hospedado</w:t>
       </w:r>
       <w:proofErr w:type="spellEnd"/>
       <w:r>
         <w:rPr>
           <w:lang w:val="es-PE"/>
         </w:rPr>
-        <w:t xml:space="preserve">, sin dependencia de </w:t>
       </w:r>
       <w:proofErr w:type="spellStart"/>
       <w:r>
         <w:rPr>
           <w:lang w:val="es-PE"/>
         </w:rPr>
-        <w:t>APIs</w:t>
       </w:r>
       <w:proofErr w:type="spellEnd"/>
       <w:r>
         <w:rPr>
           <w:lang w:val="es-PE"/>
         </w:rPr>
-        <w:t xml:space="preserve"> pagas.</w:t>
       </w:r>
     </w:p>
     <w:p>
@@ -3714,7 +3705,7 @@
           <w:sz w:val="28"/>
           <w:lang w:val="es-PE"/>
         </w:rPr>
-        <w:t>7. Indicadores objetivamente verificables (OE2, R2.1)</w:t>
+        <w:t>7. Indicadores objetivamente verificables (OE1, R1.1/R1.2)</w:t>
       </w:r>
     </w:p>
     <w:p>
@@ -3843,7 +3834,7 @@
         <w:rPr>
           <w:lang w:val="es-PE"/>
         </w:rPr>
-        <w:t>El Sprint 2 concluye con la selección justificada de los modelos LLM y de embeddings que alimentan el pipeline RAG del Tutor IA. Los criterios técnicos (latencia, consumo, calidad subjetiva, Recall@5) y los operacionales (Ollama auto-hospedado, compatibilidad con pgvector, sin APIs pagas) convergen en una decisión defendible ante la asesoría y trazable a los Resultados Esperados del OE2.</w:t>
+        <w:t>El Sprint 2 concluye con la selección justificada de los modelos LLM y de embeddings que alimentan el pipeline RAG del Tutor IA. Los criterios técnicos (latencia, consumo, calidad subjetiva, Recall@5) y los operacionales (Ollama auto-hospedado, compatibilidad con pgvector, sin APIs pagas) convergen en una decisión defendible ante la asesoría y trazable a los Resultados Esperados del OE1.</w:t>
       </w:r>
     </w:p>
     <w:p>
@@ -3857,7 +3848,7 @@
         <w:rPr>
           <w:lang w:val="es-PE"/>
         </w:rPr>
-        <w:t>El Sprint 3 construye sobre esta selección el pipeline RAG completo (ingesta, retrieval, generación aumentada, caché) y el Sprint 4 valida cuantitativamente ese pipeline con el framework RAGAS (faithfulness ≥ 0,75 y answer relevancy ≥ 0,70 como umbrales objetivos), cerrando el ciclo CRISP-DM del proyecto.</w:t>
+        <w:t>El Sprint 3 construye sobre esta selección el pipeline RAG completo (ingesta, retrieval, generación aumentada, caché) y el Sprint 4 valida cuantitativamente ese pipeline con el framework RAGAS (faithfulness ≥ 0,65 y answer relevancy ≥ 0,65 como umbrales objetivos), cerrando el ciclo CRISP-DM del proyecto.</w:t>
       </w:r>
     </w:p>
     <w:p>

</xml_diff>